<commit_message>
fix(cession): template routing, PV cleanup, SARL/SARLAU variants
- Fix template routing in edit mode (formeDir fallback)
- Clean PV-AGE-Cession template: remove 23 hardcoded paragraphs
- Create SARL (DES ASSOCIÉS) and SARLAU (DE L'ASSOCIÉ UNIQUE) variants
- Rename _Cession to _cession_md, remove from routing (fallback to _Cession_SARL)
- Fix verb agreement in step 5 (déclare/déclarent, se réunit/se réunissent)
- Auto-generate default PV resolutions when not saved
- Update _editeur and _gestionnaire references
</commit_message>
<xml_diff>
--- a/templates/_Cession_SARL/PV-AGE-Cession_A_Template.docx
+++ b/templates/_Cession_SARL/PV-AGE-Cession_A_Template.docx
@@ -23,7 +23,7 @@
           <w:sz w:val="22"/>
           <w:szCs w:val="22"/>
         </w:rPr>
-        <w:t xml:space="preserve">Denomination sociale : {{ SOCIETE_RAISON_SOCIALE }}</w:t>
+        <w:t xml:space="preserve">Dénomination sociale : {{ SOCIETE_RAISON_SOCIALE }}</w:t>
       </w:r>
     </w:p>
     <w:p>
@@ -53,7 +53,7 @@
           <w:sz w:val="22"/>
           <w:szCs w:val="22"/>
         </w:rPr>
-        <w:t xml:space="preserve">Siege social : {{ SOCIETE_ADRESSE_SIEGE }}</w:t>
+        <w:t xml:space="preserve">Siège social : {{ SOCIETE_ADRESSE_SIEGE }}</w:t>
       </w:r>
     </w:p>
     <w:p>
@@ -78,7 +78,7 @@
           <w:b w:val="1"/>
           <w:bCs w:val="1"/>
         </w:rPr>
-        <w:t xml:space="preserve">PROCES-VERBAL DE L'ASSEMBLEE GENERALE ORDINAIRE DE L'ASSOCIE UNIQUE</w:t>
+        <w:t xml:space="preserve">PROCÈS-VERBAL DE L'ASSEMBLÉE GÉNÉRALE ORDINAIRE DES ASSOCIÉS</w:t>
       </w:r>
     </w:p>
     <w:p>
@@ -108,27 +108,27 @@
           <w:sz w:val="22"/>
           <w:szCs w:val="22"/>
         </w:rPr>
-        <w:t xml:space="preserve">President de seance : {{ CEDANT_NOM_COMPLET }}</w:t>
-      </w:r>
-    </w:p>
-    <w:p>
-      <w:pPr/>
-      <w:r>
-        <w:rPr>
-          <w:sz w:val="22"/>
-          <w:szCs w:val="22"/>
-        </w:rPr>
-        <w:t xml:space="preserve">L'an deux mille {{ ANNEE }}, le {{ CESSION_DATE }}, l'Associe Unique de la societe {{ SOCIETE_RAISON_SOCIALE }}, s'est reuni en Assemblee Generale Ordinaire au siege social.</w:t>
-      </w:r>
-    </w:p>
-    <w:p>
-      <w:pPr/>
-      <w:r>
-        <w:rPr>
-          <w:sz w:val="22"/>
-          <w:szCs w:val="22"/>
-        </w:rPr>
-        <w:t xml:space="preserve">Apres avoir constate que toutes les dispositions legales et statutaires ont ete respectees, l'Associe Unique examine l'ordre du jour suivant :</w:t>
+        <w:t xml:space="preserve">Président de séance : {{ CEDANT_NOM_COMPLET }}</w:t>
+      </w:r>
+    </w:p>
+    <w:p>
+      <w:pPr/>
+      <w:r>
+        <w:rPr>
+          <w:sz w:val="22"/>
+          <w:szCs w:val="22"/>
+        </w:rPr>
+        <w:t xml:space="preserve">L'an deux mille {{ ANNEE }}, le {{ CESSION_DATE }}, les associés de la société {{ SOCIETE_RAISON_SOCIALE }}, se sont réunis en Assemblée Générale Ordinaire au siège social.</w:t>
+      </w:r>
+    </w:p>
+    <w:p>
+      <w:pPr/>
+      <w:r>
+        <w:rPr>
+          <w:sz w:val="22"/>
+          <w:szCs w:val="22"/>
+        </w:rPr>
+        <w:t xml:space="preserve">Après avoir constaté que toutes les dispositions légales et statutaires ont été respectées, les associés examinent l'ordre du jour suivant :</w:t>
       </w:r>
     </w:p>
     <w:p>
@@ -162,36 +162,6 @@
           <w:sz w:val="22"/>
           <w:szCs w:val="22"/>
         </w:rPr>
-        <w:t xml:space="preserve">2. Agrement du ou des nouveaux associes</w:t>
-      </w:r>
-    </w:p>
-    <w:p>
-      <w:pPr/>
-      <w:r>
-        <w:rPr>
-          <w:sz w:val="22"/>
-          <w:szCs w:val="22"/>
-        </w:rPr>
-        <w:t xml:space="preserve">3. Modification des statuts (article relatif aux associes et au capital social)</w:t>
-      </w:r>
-    </w:p>
-    <w:p>
-      <w:pPr/>
-      <w:r>
-        <w:rPr>
-          <w:sz w:val="22"/>
-          <w:szCs w:val="22"/>
-        </w:rPr>
-        <w:t xml:space="preserve">4. Pouvoirs pour formalites</w:t>
-      </w:r>
-    </w:p>
-    <w:p>
-      <w:pPr/>
-      <w:r>
-        <w:rPr>
-          <w:sz w:val="22"/>
-          <w:szCs w:val="22"/>
-        </w:rPr>
         <w:t xml:space="preserve">{{ PV_RESOLUTION_1 }}</w:t>
       </w:r>
     </w:p>
@@ -212,26 +182,6 @@
           <w:sz w:val="22"/>
           <w:szCs w:val="22"/>
         </w:rPr>
-        <w:t xml:space="preserve">L'Associe Unique {{ CEDANT_NOM_COMPLET }}, titulaire de la totalite des parts sociales de la societe, declare ceder a {{ CESSIONNAIRE_CIVILITE }} {{ CESSIONNAIRE_NOM_COMPLET }}, de nationalite {{ CESSIONNAIRE_NATIONALITE }}, demeurant a {{ CESSIONNAIRE_ADRESSE }}, {{ PARTS_CEDEES }} parts sociales de {{ SOCIETE_VALEUR_NOMINALE }} DH chacune, pour un montant total de {{ PRIX_TOTAL }} DH.</w:t>
-      </w:r>
-    </w:p>
-    <w:p>
-      <w:pPr/>
-      <w:r>
-        <w:rPr>
-          <w:sz w:val="22"/>
-          <w:szCs w:val="22"/>
-        </w:rPr>
-        <w:t xml:space="preserve">L'Associe Unique accepte expressement cette cession et reconnait que le prix de cession a ete regle entre les parties.</w:t>
-      </w:r>
-    </w:p>
-    <w:p>
-      <w:pPr/>
-      <w:r>
-        <w:rPr>
-          <w:sz w:val="22"/>
-          <w:szCs w:val="22"/>
-        </w:rPr>
         <w:t xml:space="preserve">{{ PV_RESOLUTION_2 }}</w:t>
       </w:r>
     </w:p>
@@ -252,16 +202,6 @@
           <w:sz w:val="22"/>
           <w:szCs w:val="22"/>
         </w:rPr>
-        <w:t xml:space="preserve">L'Associe Unique agree la cession susmentionnee et accepte l'entree du nouvel associe dans le capital social de la societe.</w:t>
-      </w:r>
-    </w:p>
-    <w:p>
-      <w:pPr/>
-      <w:r>
-        <w:rPr>
-          <w:sz w:val="22"/>
-          <w:szCs w:val="22"/>
-        </w:rPr>
         <w:t xml:space="preserve">{{ PV_RESOLUTION_3 }}</w:t>
       </w:r>
     </w:p>
@@ -282,7 +222,17 @@
           <w:sz w:val="22"/>
           <w:szCs w:val="22"/>
         </w:rPr>
-        <w:t xml:space="preserve">En consequence de la cession, l'Associe Unique decide de modifier l'article 7 des statuts relatif a la repartition du capital social, lequel sera desormais redige comme suit :</w:t>
+        <w:t xml:space="preserve">{{ PV_RESOLUTION_4 }}</w:t>
+      </w:r>
+    </w:p>
+    <w:p>
+      <w:pPr/>
+      <w:r>
+        <w:rPr>
+          <w:sz w:val="22"/>
+          <w:szCs w:val="22"/>
+        </w:rPr>
+        <w:t xml:space="preserve">{{ PV_TITLE_4 }}</w:t>
       </w:r>
     </w:p>
     <w:p>
@@ -296,183 +246,31 @@
           <w:b w:val="1"/>
           <w:bCs w:val="1"/>
         </w:rPr>
-        <w:t xml:space="preserve">Article 7 - Capital Social</w:t>
-      </w:r>
-    </w:p>
-    <w:p>
-      <w:pPr/>
-      <w:r>
-        <w:rPr>
-          <w:sz w:val="22"/>
-          <w:szCs w:val="22"/>
-        </w:rPr>
-        <w:t xml:space="preserve">Le capital social est fixe a la somme de {{ SOCIETE_CAPITAL }} DH, divise en {{ SOCIETE_PART_SOCIAL }} parts sociales de {{ SOCIETE_VALEUR_NOMINALE }} DH chacune, reparties comme suit :</w:t>
-      </w:r>
-    </w:p>
-    <w:p>
-      <w:pPr/>
-      <w:r>
-        <w:rPr>
-          <w:sz w:val="22"/>
-          <w:szCs w:val="22"/>
-        </w:rPr>
-        <w:t xml:space="preserve">- {{ CESSIONNAIRE_NOM_COMPLET }} : {{ PARTS_CEDEES }} parts</w:t>
-      </w:r>
-    </w:p>
-    <w:p>
-      <w:pPr/>
-      <w:r>
-        <w:rPr>
-          <w:sz w:val="22"/>
-          <w:szCs w:val="22"/>
-        </w:rPr>
-        <w:t xml:space="preserve">{{ PV_RESOLUTION_4 }}</w:t>
-      </w:r>
-    </w:p>
-    <w:p>
-      <w:pPr/>
-      <w:r>
-        <w:rPr>
-          <w:sz w:val="22"/>
-          <w:szCs w:val="22"/>
-        </w:rPr>
-        <w:t xml:space="preserve">{{ PV_TITLE_4 }}</w:t>
-      </w:r>
-    </w:p>
-    <w:p>
-      <w:pPr/>
-      <w:r>
-        <w:rPr>
-          <w:sz w:val="22"/>
-          <w:szCs w:val="22"/>
-        </w:rPr>
-        <w:t xml:space="preserve">Tous pouvoirs sont donnes a {{ CEDANT_NOM_COMPLET }}, pour effectuer toutes formalites de depot et d'inscription modificative aupres du greffe du tribunal de commerce, ainsi que toutes autres demarches requises par la loi.</w:t>
-      </w:r>
-    </w:p>
-    <w:p>
-      <w:pPr/>
-      <w:r>
-        <w:rPr>
-          <w:sz w:val="22"/>
-          <w:szCs w:val="22"/>
-        </w:rPr>
-        <w:t xml:space="preserve">{{ PV_RESOLUTION_10 }}</w:t>
-      </w:r>
-    </w:p>
-    <w:p>
-      <w:pPr/>
-      <w:r>
-        <w:rPr>
-          <w:sz w:val="22"/>
-          <w:szCs w:val="22"/>
-        </w:rPr>
-        <w:t xml:space="preserve">{{ PV_TITLE_10 }}</w:t>
-      </w:r>
-    </w:p>
-    <w:p>
-      <w:pPr/>
-      <w:r>
-        <w:rPr>
-          <w:sz w:val="22"/>
-          <w:szCs w:val="22"/>
-        </w:rPr>
-        <w:t xml:space="preserve">{{ PV_RESOLUTION_9 }}</w:t>
-      </w:r>
-    </w:p>
-    <w:p>
-      <w:pPr/>
-      <w:r>
-        <w:rPr>
-          <w:sz w:val="22"/>
-          <w:szCs w:val="22"/>
-        </w:rPr>
-        <w:t xml:space="preserve">{{ PV_TITLE_9 }}</w:t>
-      </w:r>
-    </w:p>
-    <w:p>
-      <w:pPr/>
-      <w:r>
-        <w:rPr>
-          <w:sz w:val="22"/>
-          <w:szCs w:val="22"/>
-        </w:rPr>
-        <w:t xml:space="preserve">{{ PV_RESOLUTION_8 }}</w:t>
-      </w:r>
-    </w:p>
-    <w:p>
-      <w:pPr/>
-      <w:r>
-        <w:rPr>
-          <w:sz w:val="22"/>
-          <w:szCs w:val="22"/>
-        </w:rPr>
-        <w:t xml:space="preserve">{{ PV_TITLE_8 }}</w:t>
-      </w:r>
-    </w:p>
-    <w:p>
-      <w:pPr/>
-      <w:r>
-        <w:rPr>
-          <w:sz w:val="22"/>
-          <w:szCs w:val="22"/>
-        </w:rPr>
-        <w:t xml:space="preserve">{{ PV_RESOLUTION_7 }}</w:t>
-      </w:r>
-    </w:p>
-    <w:p>
-      <w:pPr/>
-      <w:r>
-        <w:rPr>
-          <w:sz w:val="22"/>
-          <w:szCs w:val="22"/>
-        </w:rPr>
-        <w:t xml:space="preserve">{{ PV_TITLE_7 }}</w:t>
-      </w:r>
-    </w:p>
-    <w:p>
-      <w:pPr/>
-      <w:r>
-        <w:rPr>
-          <w:sz w:val="22"/>
-          <w:szCs w:val="22"/>
-        </w:rPr>
-        <w:t xml:space="preserve">{{ PV_RESOLUTION_6 }}</w:t>
-      </w:r>
-    </w:p>
-    <w:p>
-      <w:pPr/>
-      <w:r>
-        <w:rPr>
-          <w:sz w:val="22"/>
-          <w:szCs w:val="22"/>
-        </w:rPr>
-        <w:t xml:space="preserve">{{ PV_TITLE_6 }}</w:t>
-      </w:r>
-    </w:p>
-    <w:p>
-      <w:pPr/>
-      <w:r>
-        <w:rPr>
-          <w:sz w:val="22"/>
-          <w:szCs w:val="22"/>
-        </w:rPr>
-        <w:t xml:space="preserve">{{ PV_RESOLUTION_5 }}</w:t>
-      </w:r>
-    </w:p>
-    <w:p>
-      <w:pPr/>
-      <w:r>
-        <w:rPr>
-          <w:sz w:val="22"/>
-          <w:szCs w:val="22"/>
-        </w:rPr>
-        <w:t xml:space="preserve">{{ PV_TITLE_5 }}</w:t>
-      </w:r>
-    </w:p>
-    <w:p>
-      <w:pPr>
-        <w:jc w:val="center"/>
-      </w:pPr>
+        <w:t xml:space="preserve">Clôture de la séance</w:t>
+      </w:r>
+    </w:p>
+    <w:p>
+      <w:pPr/>
+      <w:r>
+        <w:rPr>
+          <w:sz w:val="22"/>
+          <w:szCs w:val="22"/>
+        </w:rPr>
+        <w:t xml:space="preserve">Plus rien n'étant à l'ordre du jour, la séance est levée.</w:t>
+      </w:r>
+    </w:p>
+    <w:p>
+      <w:pPr/>
+      <w:r>
+        <w:rPr>
+          <w:sz w:val="22"/>
+          <w:szCs w:val="22"/>
+        </w:rPr>
+        <w:t xml:space="preserve">Fait à {{ SOCIETE_VILLE }}, le {{ CESSION_DATE }}</w:t>
+      </w:r>
+    </w:p>
+    <w:p>
+      <w:pPr/>
       <w:r>
         <w:rPr>
           <w:sz w:val="22"/>
@@ -480,39 +278,7 @@
           <w:b w:val="1"/>
           <w:bCs w:val="1"/>
         </w:rPr>
-        <w:t xml:space="preserve">Cloture de la seance</w:t>
-      </w:r>
-    </w:p>
-    <w:p>
-      <w:pPr/>
-      <w:r>
-        <w:rPr>
-          <w:sz w:val="22"/>
-          <w:szCs w:val="22"/>
-        </w:rPr>
-        <w:t xml:space="preserve">Plus rien n'etant a l'ordre du jour, la seance est levee.</w:t>
-      </w:r>
-    </w:p>
-    <w:p>
-      <w:pPr/>
-      <w:r>
-        <w:rPr>
-          <w:sz w:val="22"/>
-          <w:szCs w:val="22"/>
-        </w:rPr>
-        <w:t xml:space="preserve">Fait a {{ SOCIETE_VILLE }}, le {{ CESSION_DATE }}</w:t>
-      </w:r>
-    </w:p>
-    <w:p>
-      <w:pPr/>
-      <w:r>
-        <w:rPr>
-          <w:sz w:val="22"/>
-          <w:szCs w:val="22"/>
-          <w:b w:val="1"/>
-          <w:bCs w:val="1"/>
-        </w:rPr>
-        <w:t xml:space="preserve">L'Associe Unique</w:t>
+        <w:t xml:space="preserve">Les Associés</w:t>
       </w:r>
     </w:p>
     <w:p>

</xml_diff>

<commit_message>
fix(cession): PV wording (AGE/Décisions), sociétés incomplètes supprimées, dashboard compacté, boutons nav step5
</commit_message>
<xml_diff>
--- a/templates/_Cession_SARL/PV-AGE-Cession_A_Template.docx
+++ b/templates/_Cession_SARL/PV-AGE-Cession_A_Template.docx
@@ -78,7 +78,7 @@
           <w:b w:val="1"/>
           <w:bCs w:val="1"/>
         </w:rPr>
-        <w:t xml:space="preserve">PROCÈS-VERBAL DE L'ASSEMBLÉE GÉNÉRALE ORDINAIRE DES ASSOCIÉS</w:t>
+        <w:t xml:space="preserve">PROCÈS-VERBAL D'ASSEMBLÉE GÉNÉRALE EXTRAORDINAIRE (AGE)</w:t>
       </w:r>
     </w:p>
     <w:p>
@@ -118,7 +118,7 @@
           <w:sz w:val="22"/>
           <w:szCs w:val="22"/>
         </w:rPr>
-        <w:t xml:space="preserve">L'an deux mille {{ ANNEE }}, le {{ CESSION_DATE }}, les associés de la société {{ SOCIETE_RAISON_SOCIALE }}, se sont réunis en Assemblée Générale Ordinaire au siège social.</w:t>
+        <w:t xml:space="preserve">L'an deux mille {{ ANNEE }}, le {{ CESSION_DATE }}, les associés de la société {{ SOCIETE_RAISON_SOCIALE }}, se sont réunis en Assemblée Générale Extraordinaire au siège social.</w:t>
       </w:r>
     </w:p>
     <w:p>

</xml_diff>

<commit_message>
fix(pv): sauts de ligne DOCX avec <w:br/>, titres en gras + agrandis (13pt)
</commit_message>
<xml_diff>
--- a/templates/_Cession_SARL/PV-AGE-Cession_A_Template.docx
+++ b/templates/_Cession_SARL/PV-AGE-Cession_A_Template.docx
@@ -171,6 +171,10 @@
         <w:rPr>
           <w:sz w:val="22"/>
           <w:szCs w:val="22"/>
+          <w:sz w:val="26"/>
+          <w:szCs w:val="26"/>
+          <w:b w:val="1"/>
+          <w:bCs w:val="1"/>
         </w:rPr>
         <w:t xml:space="preserve">{{ PV_TITLE_1 }}</w:t>
       </w:r>
@@ -191,6 +195,10 @@
         <w:rPr>
           <w:sz w:val="22"/>
           <w:szCs w:val="22"/>
+          <w:sz w:val="26"/>
+          <w:szCs w:val="26"/>
+          <w:b w:val="1"/>
+          <w:bCs w:val="1"/>
         </w:rPr>
         <w:t xml:space="preserve">{{ PV_TITLE_2 }}</w:t>
       </w:r>
@@ -211,6 +219,10 @@
         <w:rPr>
           <w:sz w:val="22"/>
           <w:szCs w:val="22"/>
+          <w:sz w:val="26"/>
+          <w:szCs w:val="26"/>
+          <w:b w:val="1"/>
+          <w:bCs w:val="1"/>
         </w:rPr>
         <w:t xml:space="preserve">{{ PV_TITLE_3 }}</w:t>
       </w:r>
@@ -231,6 +243,10 @@
         <w:rPr>
           <w:sz w:val="22"/>
           <w:szCs w:val="22"/>
+          <w:sz w:val="26"/>
+          <w:szCs w:val="26"/>
+          <w:b w:val="1"/>
+          <w:bCs w:val="1"/>
         </w:rPr>
         <w:t xml:space="preserve">{{ PV_TITLE_4 }}</w:t>
       </w:r>

</xml_diff>

<commit_message>
fix(pv): ordre titre avant contenu, préfixe Résolution N, templates inversés
</commit_message>
<xml_diff>
--- a/templates/_Cession_SARL/PV-AGE-Cession_A_Template.docx
+++ b/templates/_Cession_SARL/PV-AGE-Cession_A_Template.docx
@@ -161,16 +161,6 @@
         <w:rPr>
           <w:sz w:val="22"/>
           <w:szCs w:val="22"/>
-        </w:rPr>
-        <w:t xml:space="preserve">{{ PV_RESOLUTION_1 }}</w:t>
-      </w:r>
-    </w:p>
-    <w:p>
-      <w:pPr/>
-      <w:r>
-        <w:rPr>
-          <w:sz w:val="22"/>
-          <w:szCs w:val="22"/>
           <w:sz w:val="26"/>
           <w:szCs w:val="26"/>
           <w:b w:val="1"/>
@@ -186,7 +176,7 @@
           <w:sz w:val="22"/>
           <w:szCs w:val="22"/>
         </w:rPr>
-        <w:t xml:space="preserve">{{ PV_RESOLUTION_2 }}</w:t>
+        <w:t xml:space="preserve">{{ PV_RESOLUTION_1 }}</w:t>
       </w:r>
     </w:p>
     <w:p>
@@ -210,7 +200,7 @@
           <w:sz w:val="22"/>
           <w:szCs w:val="22"/>
         </w:rPr>
-        <w:t xml:space="preserve">{{ PV_RESOLUTION_3 }}</w:t>
+        <w:t xml:space="preserve">{{ PV_RESOLUTION_2 }}</w:t>
       </w:r>
     </w:p>
     <w:p>
@@ -234,7 +224,7 @@
           <w:sz w:val="22"/>
           <w:szCs w:val="22"/>
         </w:rPr>
-        <w:t xml:space="preserve">{{ PV_RESOLUTION_4 }}</w:t>
+        <w:t xml:space="preserve">{{ PV_RESOLUTION_3 }}</w:t>
       </w:r>
     </w:p>
     <w:p>
@@ -249,6 +239,16 @@
           <w:bCs w:val="1"/>
         </w:rPr>
         <w:t xml:space="preserve">{{ PV_TITLE_4 }}</w:t>
+      </w:r>
+    </w:p>
+    <w:p>
+      <w:pPr/>
+      <w:r>
+        <w:rPr>
+          <w:sz w:val="22"/>
+          <w:szCs w:val="22"/>
+        </w:rPr>
+        <w:t xml:space="preserve">{{ PV_RESOLUTION_4 }}</w:t>
       </w:r>
     </w:p>
     <w:p>

</xml_diff>